<commit_message>
refactor: Reorganize project files into a structured `src/` directory and move documentation to `docs/`.
</commit_message>
<xml_diff>
--- a/MANTIS_SE_PROJECT_PROPOSAL_FINAL.docx
+++ b/MANTIS_SE_PROJECT_PROPOSAL_FINAL.docx
@@ -147,13 +147,12 @@
           <w:rFonts w:ascii="Times New Roman" w:hAnsi="Times New Roman" w:cs="Times New Roman"/>
         </w:rPr>
         <w:br/>
-        <w:t>[Your Name]</w:t>
       </w:r>
       <w:r>
         <w:rPr>
           <w:rFonts w:ascii="Times New Roman" w:hAnsi="Times New Roman" w:cs="Times New Roman"/>
         </w:rPr>
-        <w:br/>
+        <w:t>Anuskar Sigdel</w:t>
       </w:r>
       <w:r>
         <w:rPr>
@@ -186,7 +185,40 @@
           <w:rFonts w:ascii="Times New Roman" w:hAnsi="Times New Roman" w:cs="Times New Roman"/>
         </w:rPr>
         <w:br/>
-        <w:t>BSc Computing (Software Engineering)</w:t>
+      </w:r>
+      <w:proofErr w:type="gramStart"/>
+      <w:r>
+        <w:rPr>
+          <w:rFonts w:ascii="Times New Roman" w:hAnsi="Times New Roman" w:cs="Times New Roman"/>
+        </w:rPr>
+        <w:t>BSc</w:t>
+      </w:r>
+      <w:r>
+        <w:rPr>
+          <w:rFonts w:ascii="Times New Roman" w:hAnsi="Times New Roman" w:cs="Times New Roman"/>
+        </w:rPr>
+        <w:t>(</w:t>
+      </w:r>
+      <w:proofErr w:type="gramEnd"/>
+      <w:r>
+        <w:rPr>
+          <w:rFonts w:ascii="Times New Roman" w:hAnsi="Times New Roman" w:cs="Times New Roman"/>
+        </w:rPr>
+        <w:t xml:space="preserve">Hons.) </w:t>
+      </w:r>
+      <w:proofErr w:type="gramStart"/>
+      <w:r>
+        <w:rPr>
+          <w:rFonts w:ascii="Times New Roman" w:hAnsi="Times New Roman" w:cs="Times New Roman"/>
+        </w:rPr>
+        <w:t>Computing</w:t>
+      </w:r>
+      <w:proofErr w:type="gramEnd"/>
+      <w:r>
+        <w:rPr>
+          <w:rFonts w:ascii="Times New Roman" w:hAnsi="Times New Roman" w:cs="Times New Roman"/>
+        </w:rPr>
+        <w:t xml:space="preserve"> </w:t>
       </w:r>
       <w:r>
         <w:rPr>
@@ -218,7 +250,13 @@
         <w:rPr>
           <w:rFonts w:ascii="Times New Roman" w:hAnsi="Times New Roman" w:cs="Times New Roman"/>
         </w:rPr>
-        <w:t>The University [Your University Name]</w:t>
+        <w:t xml:space="preserve">The University </w:t>
+      </w:r>
+      <w:r>
+        <w:rPr>
+          <w:rFonts w:ascii="Times New Roman" w:hAnsi="Times New Roman" w:cs="Times New Roman"/>
+        </w:rPr>
+        <w:t>of Northampthon</w:t>
       </w:r>
       <w:r>
         <w:rPr>
@@ -249,6 +287,14 @@
     </w:p>
     <w:sdt>
       <w:sdtPr>
+        <w:rPr>
+          <w:rFonts w:ascii="Arial" w:eastAsiaTheme="minorEastAsia" w:hAnsi="Arial" w:cstheme="minorBidi"/>
+          <w:b w:val="0"/>
+          <w:bCs w:val="0"/>
+          <w:color w:val="auto"/>
+          <w:sz w:val="22"/>
+          <w:szCs w:val="22"/>
+        </w:rPr>
         <w:id w:val="1263185795"/>
         <w:docPartObj>
           <w:docPartGallery w:val="Table of Contents"/>
@@ -257,11 +303,7 @@
       </w:sdtPr>
       <w:sdtEndPr>
         <w:rPr>
-          <w:rFonts w:ascii="Arial" w:eastAsiaTheme="minorEastAsia" w:hAnsi="Arial" w:cstheme="minorBidi"/>
           <w:noProof/>
-          <w:color w:val="auto"/>
-          <w:sz w:val="22"/>
-          <w:szCs w:val="22"/>
         </w:rPr>
       </w:sdtEndPr>
       <w:sdtContent>
@@ -1456,6 +1498,17 @@
           <w:szCs w:val="24"/>
         </w:rPr>
       </w:pPr>
+    </w:p>
+    <w:p>
+      <w:pPr>
+        <w:spacing w:after="0" w:line="360" w:lineRule="auto"/>
+        <w:jc w:val="both"/>
+        <w:rPr>
+          <w:rFonts w:ascii="Times New Roman" w:hAnsi="Times New Roman" w:cs="Times New Roman"/>
+          <w:sz w:val="24"/>
+          <w:szCs w:val="24"/>
+        </w:rPr>
+      </w:pPr>
       <w:r>
         <w:rPr>
           <w:rFonts w:ascii="Times New Roman" w:hAnsi="Times New Roman" w:cs="Times New Roman"/>
@@ -2150,19 +2203,6 @@
           <w:rFonts w:ascii="Times New Roman" w:hAnsi="Times New Roman" w:cs="Times New Roman"/>
         </w:rPr>
       </w:pPr>
-      <w:r>
-        <w:rPr>
-          <w:rFonts w:ascii="Times New Roman" w:hAnsi="Times New Roman" w:cs="Times New Roman"/>
-        </w:rPr>
-        <w:t>Please insert the Gantt Chart image here.</w:t>
-      </w:r>
-    </w:p>
-    <w:p>
-      <w:pPr>
-        <w:rPr>
-          <w:rFonts w:ascii="Times New Roman" w:hAnsi="Times New Roman" w:cs="Times New Roman"/>
-        </w:rPr>
-      </w:pPr>
     </w:p>
     <w:sectPr>
       <w:pgSz w:w="12240" w:h="15840"/>

</xml_diff>